<commit_message>
feat: pagina de artigo + view transitions + reader.css partilhado
- Nova pagina /documentos/portugal-mundo-multipolar/ com layout completo
- View Transition API: morphing do titulo entre listagem e artigo
- reader.css partilhado para todos os artigos (accordions, tabelas, TOC)
- Cards na listagem com links diretos + view-transition-name
- .docx atualizado do Google Drive
- Breadcrumb + navegacao anterior/proximo no artigo
</commit_message>
<xml_diff>
--- a/apps/web/docs/whitepapers/WHITEPAPER_PORTUGAL_MUNDO_MULTIPOLAR_UNIR.docx
+++ b/apps/web/docs/whitepapers/WHITEPAPER_PORTUGAL_MUNDO_MULTIPOLAR_UNIR.docx
@@ -317,7 +317,7 @@
     </w:p>
     <w:sdt>
       <w:sdtPr>
-        <w:id w:val="134307651"/>
+        <w:id w:val="374490485"/>
         <w:docPartObj>
           <w:docPartGallery w:val="Table of Contents"/>
           <w:docPartUnique w:val="1"/>
@@ -7720,6 +7720,16 @@
     </w:p>
     <w:p>
       <w:pPr>
+        <w:rPr/>
+      </w:pPr>
+      <w:r>
+        <w:rPr>
+          <w:rtl w:val="0"/>
+        </w:rPr>
+      </w:r>
+    </w:p>
+    <w:p>
+      <w:pPr>
         <w:pBdr>
           <w:top w:space="0" w:sz="0" w:val="nil"/>
           <w:left w:space="0" w:sz="0" w:val="nil"/>
@@ -8088,6 +8098,7 @@
           <w:between w:space="0" w:sz="0" w:val="nil"/>
         </w:pBdr>
         <w:shd w:fill="auto" w:val="clear"/>
+        <w:ind w:firstLine="0"/>
         <w:rPr>
           <w:b w:val="1"/>
           <w:bCs w:val="1"/>
@@ -8230,6 +8241,26 @@
           <w:rtl w:val="0"/>
         </w:rPr>
         <w:t xml:space="preserve">10. Plano de Implementação (2026-2035)</w:t>
+      </w:r>
+    </w:p>
+    <w:p>
+      <w:pPr>
+        <w:pStyle w:val="Heading3"/>
+        <w:pBdr>
+          <w:top w:space="0" w:sz="0" w:val="nil"/>
+          <w:left w:space="0" w:sz="0" w:val="nil"/>
+          <w:bottom w:space="0" w:sz="0" w:val="nil"/>
+          <w:right w:space="0" w:sz="0" w:val="nil"/>
+          <w:between w:space="0" w:sz="0" w:val="nil"/>
+        </w:pBdr>
+        <w:shd w:fill="auto" w:val="clear"/>
+        <w:spacing w:before="0" w:lineRule="auto"/>
+        <w:rPr/>
+      </w:pPr>
+      <w:r>
+        <w:rPr>
+          <w:rtl w:val="0"/>
+        </w:rPr>
       </w:r>
     </w:p>
     <w:p>
@@ -10202,33 +10233,18 @@
         <w:pStyle w:val="Heading1"/>
         <w:rPr/>
       </w:pPr>
-      <w:bookmarkStart w:colFirst="0" w:colLast="0" w:name="_wiefr6eycli" w:id="41"/>
+      <w:bookmarkStart w:colFirst="0" w:colLast="0" w:name="_qqkt8hknbbdv" w:id="41"/>
       <w:bookmarkEnd w:id="41"/>
       <w:r>
         <w:rPr>
           <w:rtl w:val="0"/>
         </w:rPr>
-        <w:t xml:space="preserve">12. Conclusão e Próximos Passos</w:t>
-      </w:r>
-    </w:p>
-    <w:p>
-      <w:pPr>
-        <w:pStyle w:val="Heading2"/>
-        <w:pBdr>
-          <w:top w:space="0" w:sz="0" w:val="nil"/>
-          <w:left w:space="0" w:sz="0" w:val="nil"/>
-          <w:bottom w:space="0" w:sz="0" w:val="nil"/>
-          <w:right w:space="0" w:sz="0" w:val="nil"/>
-          <w:between w:space="0" w:sz="0" w:val="nil"/>
-        </w:pBdr>
-        <w:shd w:fill="auto" w:val="clear"/>
-        <w:rPr/>
-      </w:pPr>
-      <w:r>
-        <w:rPr>
-          <w:rtl w:val="0"/>
-        </w:rPr>
         <w:t xml:space="preserve">11. Análise de Riscos e Mitigação</w:t>
+      </w:r>
+      <w:r>
+        <w:rPr>
+          <w:rtl w:val="0"/>
+        </w:rPr>
       </w:r>
     </w:p>
     <w:p>
@@ -10761,13 +10777,26 @@
         <w:pStyle w:val="Heading1"/>
         <w:rPr/>
       </w:pPr>
-      <w:bookmarkStart w:colFirst="0" w:colLast="0" w:name="_pk9dfpfyp4px" w:id="42"/>
+      <w:bookmarkStart w:colFirst="0" w:colLast="0" w:name="_72vxx6tebqib" w:id="42"/>
       <w:bookmarkEnd w:id="42"/>
       <w:r>
         <w:rPr>
           <w:rtl w:val="0"/>
         </w:rPr>
-        <w:t xml:space="preserve">11. Análise de Riscos e Mitigação</w:t>
+      </w:r>
+    </w:p>
+    <w:p>
+      <w:pPr>
+        <w:pStyle w:val="Heading1"/>
+        <w:rPr/>
+      </w:pPr>
+      <w:bookmarkStart w:colFirst="0" w:colLast="0" w:name="_1u30pnb5nzt9" w:id="43"/>
+      <w:bookmarkEnd w:id="43"/>
+      <w:r>
+        <w:rPr>
+          <w:rtl w:val="0"/>
+        </w:rPr>
+        <w:t xml:space="preserve">12. Conclusão e Próximos Passos</w:t>
       </w:r>
     </w:p>
     <w:p>

</xml_diff>